<commit_message>
feat: add currency swap and responsive desktop layout
</commit_message>
<xml_diff>
--- a/currency-converter-app-js.docx
+++ b/currency-converter-app-js.docx
@@ -104,7 +104,13 @@
         </w:pBdr>
       </w:pPr>
       <w:r>
-        <w:t xml:space="preserve">Aqui estamos a criar as </w:t>
+        <w:t xml:space="preserve">Aqui </w:t>
+      </w:r>
+      <w:r>
+        <w:t>estou</w:t>
+      </w:r>
+      <w:r>
+        <w:t xml:space="preserve"> a criar as </w:t>
       </w:r>
       <w:r>
         <w:rPr>
@@ -123,13 +129,6 @@
       <w:r>
         <w:t>É como se eu quisesse dar nomes curtos aos objetos da minha página para não ter de os procurar sempre que eu precisar deles.</w:t>
       </w:r>
-    </w:p>
-    <w:p>
-      <w:pPr>
-        <w:pBdr>
-          <w:bottom w:val="single" w:sz="12" w:space="1" w:color="auto"/>
-        </w:pBdr>
-      </w:pPr>
     </w:p>
     <w:p/>
     <w:p>
@@ -245,30 +244,28 @@
       </w:r>
     </w:p>
     <w:p>
-      <w:r>
-        <w:rPr>
-          <w:b/>
-          <w:bCs/>
-        </w:rPr>
-        <w:t>async:</w:t>
-      </w:r>
-      <w:r>
-        <w:rPr>
-          <w:b/>
-          <w:bCs/>
-        </w:rPr>
-        <w:t xml:space="preserve"> </w:t>
-      </w:r>
-      <w:r>
-        <w:t>Avisa que esta função vai fazer algo que demora tempo (ir á internet).</w:t>
-      </w:r>
-    </w:p>
-    <w:p>
       <w:pPr>
         <w:pBdr>
           <w:bottom w:val="single" w:sz="12" w:space="1" w:color="auto"/>
         </w:pBdr>
       </w:pPr>
+      <w:r>
+        <w:rPr>
+          <w:b/>
+          <w:bCs/>
+        </w:rPr>
+        <w:t>async:</w:t>
+      </w:r>
+      <w:r>
+        <w:rPr>
+          <w:b/>
+          <w:bCs/>
+        </w:rPr>
+        <w:t xml:space="preserve"> </w:t>
+      </w:r>
+      <w:r>
+        <w:t>Avisa que esta função vai fazer algo que demora tempo (ir á internet).</w:t>
+      </w:r>
     </w:p>
     <w:p/>
     <w:p>
@@ -278,68 +275,28 @@
           <w:bCs/>
         </w:rPr>
       </w:pPr>
-    </w:p>
-    <w:p>
-      <w:pPr>
-        <w:rPr>
-          <w:b/>
-          <w:bCs/>
-        </w:rPr>
-      </w:pPr>
-    </w:p>
-    <w:p>
-      <w:pPr>
-        <w:rPr>
-          <w:b/>
-          <w:bCs/>
-        </w:rPr>
-      </w:pPr>
-    </w:p>
-    <w:p>
-      <w:pPr>
-        <w:rPr>
-          <w:b/>
-          <w:bCs/>
-        </w:rPr>
-      </w:pPr>
-    </w:p>
-    <w:p>
-      <w:pPr>
-        <w:rPr>
-          <w:b/>
-          <w:bCs/>
-        </w:rPr>
-      </w:pPr>
-    </w:p>
-    <w:p>
-      <w:pPr>
-        <w:rPr>
-          <w:b/>
-          <w:bCs/>
-        </w:rPr>
-      </w:pPr>
-      <w:r>
-        <w:rPr>
-          <w:b/>
-          <w:bCs/>
+      <w:r>
+        <w:rPr>
+          <w:b/>
+          <w:bCs/>
+        </w:rPr>
+        <w:t>O fetch (A viagem à API)</w:t>
+      </w:r>
+    </w:p>
+    <w:p>
+      <w:r>
+        <w:t xml:space="preserve">Esta </w:t>
+      </w:r>
+      <w:r>
+        <w:t>é a parte onde o meu código “sai” do meu computador e vai buscar ao servidor da ExchangeRate-API.</w:t>
+      </w:r>
+    </w:p>
+    <w:p>
+      <w:r>
+        <w:rPr>
+          <w:noProof/>
         </w:rPr>
         <w:lastRenderedPageBreak/>
-        <w:t>O fetch (A viagem à API)</w:t>
-      </w:r>
-    </w:p>
-    <w:p>
-      <w:r>
-        <w:t xml:space="preserve">Esta </w:t>
-      </w:r>
-      <w:r>
-        <w:t>é a parte onde o meu código “sai” do meu computador e vai buscar ao servidor da ExchangeRate-API.</w:t>
-      </w:r>
-    </w:p>
-    <w:p>
-      <w:r>
-        <w:rPr>
-          <w:noProof/>
-        </w:rPr>
         <w:drawing>
           <wp:inline distT="0" distB="0" distL="0" distR="0" wp14:anchorId="580F70FD" wp14:editId="1AF2D338">
             <wp:extent cx="5400040" cy="1976755"/>
@@ -497,13 +454,6 @@
     </w:p>
     <w:p>
       <w:pPr>
-        <w:pBdr>
-          <w:bottom w:val="single" w:sz="12" w:space="1" w:color="auto"/>
-        </w:pBdr>
-      </w:pPr>
-    </w:p>
-    <w:p>
-      <w:pPr>
         <w:rPr>
           <w:b/>
           <w:bCs/>
@@ -660,24 +610,24 @@
     </w:p>
     <w:p>
       <w:pPr>
-        <w:pBdr>
-          <w:bottom w:val="single" w:sz="12" w:space="1" w:color="auto"/>
-        </w:pBdr>
-      </w:pPr>
-    </w:p>
-    <w:p>
-      <w:pPr>
-        <w:rPr>
-          <w:b/>
-          <w:bCs/>
-        </w:rPr>
-      </w:pPr>
-      <w:r>
-        <w:rPr>
-          <w:b/>
-          <w:bCs/>
-        </w:rPr>
-        <w:lastRenderedPageBreak/>
+        <w:rPr>
+          <w:b/>
+          <w:bCs/>
+        </w:rPr>
+      </w:pPr>
+    </w:p>
+    <w:p>
+      <w:pPr>
+        <w:rPr>
+          <w:b/>
+          <w:bCs/>
+        </w:rPr>
+      </w:pPr>
+      <w:r>
+        <w:rPr>
+          <w:b/>
+          <w:bCs/>
+        </w:rPr>
         <w:t>A rede de Segurança (Try/Catch)</w:t>
       </w:r>
     </w:p>
@@ -736,6 +686,7 @@
     </w:p>
     <w:p>
       <w:r>
+        <w:lastRenderedPageBreak/>
         <w:t xml:space="preserve">O </w:t>
       </w:r>
       <w:r>
@@ -812,12 +763,498 @@
       </w:r>
     </w:p>
     <w:p>
+      <w:pPr>
+        <w:pBdr>
+          <w:bottom w:val="single" w:sz="12" w:space="1" w:color="auto"/>
+        </w:pBdr>
+      </w:pPr>
       <w:r>
         <w:t>innerText:</w:t>
       </w:r>
       <w:r>
         <w:t xml:space="preserve"> É uma propriedade usada para ler ou definir o conteúdo de texto visível de um elemento html e os seus descentes.</w:t>
       </w:r>
+    </w:p>
+    <w:p/>
+    <w:p>
+      <w:pPr>
+        <w:rPr>
+          <w:b/>
+          <w:bCs/>
+        </w:rPr>
+      </w:pPr>
+      <w:r>
+        <w:rPr>
+          <w:b/>
+          <w:bCs/>
+        </w:rPr>
+        <w:t>As bandeiras (Identidade Visual)</w:t>
+      </w:r>
+    </w:p>
+    <w:p>
+      <w:pPr>
+        <w:pBdr>
+          <w:bottom w:val="single" w:sz="12" w:space="1" w:color="auto"/>
+        </w:pBdr>
+      </w:pPr>
+      <w:r>
+        <w:t>Para que o utilizador veja a bandeira correta, o JavaScript precisa de traduzir o código da moeda para um código do pais que a API de imagens entenda</w:t>
+      </w:r>
+      <w:r>
+        <w:t>.</w:t>
+      </w:r>
+    </w:p>
+    <w:p>
+      <w:pPr>
+        <w:rPr>
+          <w:b/>
+          <w:bCs/>
+          <w:noProof/>
+        </w:rPr>
+      </w:pPr>
+    </w:p>
+    <w:p>
+      <w:pPr>
+        <w:rPr>
+          <w:b/>
+          <w:bCs/>
+        </w:rPr>
+      </w:pPr>
+      <w:r>
+        <w:rPr>
+          <w:b/>
+          <w:bCs/>
+        </w:rPr>
+        <w:t>A</w:t>
+      </w:r>
+      <w:r>
+        <w:rPr>
+          <w:b/>
+          <w:bCs/>
+        </w:rPr>
+        <w:t xml:space="preserve"> seleção (Os novos olhos)</w:t>
+      </w:r>
+    </w:p>
+    <w:p>
+      <w:pPr>
+        <w:rPr>
+          <w:b/>
+          <w:bCs/>
+        </w:rPr>
+      </w:pPr>
+      <w:r>
+        <w:rPr>
+          <w:b/>
+          <w:bCs/>
+          <w:noProof/>
+        </w:rPr>
+        <w:drawing>
+          <wp:inline distT="0" distB="0" distL="0" distR="0" wp14:anchorId="591AF486" wp14:editId="2FF103B5">
+            <wp:extent cx="4915586" cy="647790"/>
+            <wp:effectExtent l="0" t="0" r="0" b="0"/>
+            <wp:docPr id="8" name="Imagem 8" descr="Uma imagem com texto, Tipo de letra, captura de ecrã, file&#10;&#10;Os conteúdos gerados por IA poderão estar incorretos."/>
+            <wp:cNvGraphicFramePr>
+              <a:graphicFrameLocks xmlns:a="http://schemas.openxmlformats.org/drawingml/2006/main" noChangeAspect="1"/>
+            </wp:cNvGraphicFramePr>
+            <a:graphic xmlns:a="http://schemas.openxmlformats.org/drawingml/2006/main">
+              <a:graphicData uri="http://schemas.openxmlformats.org/drawingml/2006/picture">
+                <pic:pic xmlns:pic="http://schemas.openxmlformats.org/drawingml/2006/picture">
+                  <pic:nvPicPr>
+                    <pic:cNvPr id="8" name="Imagem 8" descr="Uma imagem com texto, Tipo de letra, captura de ecrã, file&#10;&#10;Os conteúdos gerados por IA poderão estar incorretos."/>
+                    <pic:cNvPicPr/>
+                  </pic:nvPicPr>
+                  <pic:blipFill>
+                    <a:blip r:embed="rId10">
+                      <a:extLst>
+                        <a:ext uri="{28A0092B-C50C-407E-A947-70E740481C1C}">
+                          <a14:useLocalDpi xmlns:a14="http://schemas.microsoft.com/office/drawing/2010/main" val="0"/>
+                        </a:ext>
+                      </a:extLst>
+                    </a:blip>
+                    <a:stretch>
+                      <a:fillRect/>
+                    </a:stretch>
+                  </pic:blipFill>
+                  <pic:spPr>
+                    <a:xfrm>
+                      <a:off x="0" y="0"/>
+                      <a:ext cx="4915586" cy="647790"/>
+                    </a:xfrm>
+                    <a:prstGeom prst="rect">
+                      <a:avLst/>
+                    </a:prstGeom>
+                  </pic:spPr>
+                </pic:pic>
+              </a:graphicData>
+            </a:graphic>
+          </wp:inline>
+        </w:drawing>
+      </w:r>
+    </w:p>
+    <w:p>
+      <w:pPr>
+        <w:pBdr>
+          <w:bottom w:val="single" w:sz="12" w:space="1" w:color="auto"/>
+        </w:pBdr>
+      </w:pPr>
+      <w:r>
+        <w:rPr>
+          <w:b/>
+          <w:bCs/>
+        </w:rPr>
+        <w:t xml:space="preserve">IDs únicos: </w:t>
+      </w:r>
+      <w:r>
+        <w:t xml:space="preserve">É vital </w:t>
+      </w:r>
+      <w:r>
+        <w:t>que cada imagem tenha o seu próprio ID</w:t>
+      </w:r>
+      <w:r>
+        <w:t xml:space="preserve"> (source e target) para o JavaScript não se confundir ao aplicar as imagens.</w:t>
+      </w:r>
+    </w:p>
+    <w:p/>
+    <w:p>
+      <w:pPr>
+        <w:rPr>
+          <w:b/>
+          <w:bCs/>
+        </w:rPr>
+      </w:pPr>
+      <w:r>
+        <w:rPr>
+          <w:b/>
+          <w:bCs/>
+        </w:rPr>
+        <w:t>O Mapa (O dicionário de tradução)</w:t>
+      </w:r>
+    </w:p>
+    <w:p>
+      <w:pPr>
+        <w:rPr>
+          <w:b/>
+          <w:bCs/>
+        </w:rPr>
+      </w:pPr>
+      <w:r>
+        <w:rPr>
+          <w:b/>
+          <w:bCs/>
+          <w:noProof/>
+        </w:rPr>
+        <w:drawing>
+          <wp:inline distT="0" distB="0" distL="0" distR="0" wp14:anchorId="1B633414" wp14:editId="14355CAB">
+            <wp:extent cx="2876951" cy="1648055"/>
+            <wp:effectExtent l="0" t="0" r="0" b="9525"/>
+            <wp:docPr id="9" name="Imagem 9" descr="Uma imagem com texto, captura de ecrã, Tipo de letra, número&#10;&#10;Os conteúdos gerados por IA poderão estar incorretos."/>
+            <wp:cNvGraphicFramePr>
+              <a:graphicFrameLocks xmlns:a="http://schemas.openxmlformats.org/drawingml/2006/main" noChangeAspect="1"/>
+            </wp:cNvGraphicFramePr>
+            <a:graphic xmlns:a="http://schemas.openxmlformats.org/drawingml/2006/main">
+              <a:graphicData uri="http://schemas.openxmlformats.org/drawingml/2006/picture">
+                <pic:pic xmlns:pic="http://schemas.openxmlformats.org/drawingml/2006/picture">
+                  <pic:nvPicPr>
+                    <pic:cNvPr id="9" name="Imagem 9" descr="Uma imagem com texto, captura de ecrã, Tipo de letra, número&#10;&#10;Os conteúdos gerados por IA poderão estar incorretos."/>
+                    <pic:cNvPicPr/>
+                  </pic:nvPicPr>
+                  <pic:blipFill>
+                    <a:blip r:embed="rId11">
+                      <a:extLst>
+                        <a:ext uri="{28A0092B-C50C-407E-A947-70E740481C1C}">
+                          <a14:useLocalDpi xmlns:a14="http://schemas.microsoft.com/office/drawing/2010/main" val="0"/>
+                        </a:ext>
+                      </a:extLst>
+                    </a:blip>
+                    <a:stretch>
+                      <a:fillRect/>
+                    </a:stretch>
+                  </pic:blipFill>
+                  <pic:spPr>
+                    <a:xfrm>
+                      <a:off x="0" y="0"/>
+                      <a:ext cx="2876951" cy="1648055"/>
+                    </a:xfrm>
+                    <a:prstGeom prst="rect">
+                      <a:avLst/>
+                    </a:prstGeom>
+                  </pic:spPr>
+                </pic:pic>
+              </a:graphicData>
+            </a:graphic>
+          </wp:inline>
+        </w:drawing>
+      </w:r>
+    </w:p>
+    <w:p>
+      <w:pPr>
+        <w:pBdr>
+          <w:bottom w:val="single" w:sz="12" w:space="1" w:color="auto"/>
+        </w:pBdr>
+      </w:pPr>
+      <w:r>
+        <w:rPr>
+          <w:b/>
+          <w:bCs/>
+        </w:rPr>
+        <w:t>countryMap</w:t>
+      </w:r>
+      <w:r>
+        <w:rPr>
+          <w:b/>
+          <w:bCs/>
+        </w:rPr>
+        <w:t>:</w:t>
+      </w:r>
+      <w:r>
+        <w:t xml:space="preserve"> </w:t>
+      </w:r>
+      <w:r>
+        <w:t>Como a API de bandeiras usa códigos de 2 letras (paises) e a de cambio usa 3 (moedas), este objeto faz a ponte entre os dois.</w:t>
+      </w:r>
+    </w:p>
+    <w:p/>
+    <w:p>
+      <w:pPr>
+        <w:rPr>
+          <w:b/>
+          <w:bCs/>
+        </w:rPr>
+      </w:pPr>
+      <w:r>
+        <w:rPr>
+          <w:b/>
+          <w:bCs/>
+        </w:rPr>
+        <w:lastRenderedPageBreak/>
+        <w:t>A função (O motor de atualização)</w:t>
+      </w:r>
+    </w:p>
+    <w:p>
+      <w:pPr>
+        <w:rPr>
+          <w:b/>
+          <w:bCs/>
+        </w:rPr>
+      </w:pPr>
+      <w:r>
+        <w:rPr>
+          <w:b/>
+          <w:bCs/>
+          <w:noProof/>
+        </w:rPr>
+        <w:drawing>
+          <wp:inline distT="0" distB="0" distL="0" distR="0" wp14:anchorId="646B2290" wp14:editId="0ADA4DB8">
+            <wp:extent cx="5181600" cy="893863"/>
+            <wp:effectExtent l="0" t="0" r="0" b="1905"/>
+            <wp:docPr id="10" name="Imagem 10" descr="Uma imagem com texto, captura de ecrã, Tipo de letra, file&#10;&#10;Os conteúdos gerados por IA poderão estar incorretos."/>
+            <wp:cNvGraphicFramePr>
+              <a:graphicFrameLocks xmlns:a="http://schemas.openxmlformats.org/drawingml/2006/main" noChangeAspect="1"/>
+            </wp:cNvGraphicFramePr>
+            <a:graphic xmlns:a="http://schemas.openxmlformats.org/drawingml/2006/main">
+              <a:graphicData uri="http://schemas.openxmlformats.org/drawingml/2006/picture">
+                <pic:pic xmlns:pic="http://schemas.openxmlformats.org/drawingml/2006/picture">
+                  <pic:nvPicPr>
+                    <pic:cNvPr id="10" name="Imagem 10" descr="Uma imagem com texto, captura de ecrã, Tipo de letra, file&#10;&#10;Os conteúdos gerados por IA poderão estar incorretos."/>
+                    <pic:cNvPicPr/>
+                  </pic:nvPicPr>
+                  <pic:blipFill>
+                    <a:blip r:embed="rId12">
+                      <a:extLst>
+                        <a:ext uri="{28A0092B-C50C-407E-A947-70E740481C1C}">
+                          <a14:useLocalDpi xmlns:a14="http://schemas.microsoft.com/office/drawing/2010/main" val="0"/>
+                        </a:ext>
+                      </a:extLst>
+                    </a:blip>
+                    <a:stretch>
+                      <a:fillRect/>
+                    </a:stretch>
+                  </pic:blipFill>
+                  <pic:spPr>
+                    <a:xfrm>
+                      <a:off x="0" y="0"/>
+                      <a:ext cx="5202293" cy="897433"/>
+                    </a:xfrm>
+                    <a:prstGeom prst="rect">
+                      <a:avLst/>
+                    </a:prstGeom>
+                  </pic:spPr>
+                </pic:pic>
+              </a:graphicData>
+            </a:graphic>
+          </wp:inline>
+        </w:drawing>
+      </w:r>
+    </w:p>
+    <w:p>
+      <w:r>
+        <w:rPr>
+          <w:b/>
+          <w:bCs/>
+        </w:rPr>
+        <w:t xml:space="preserve">fallback (||): </w:t>
+      </w:r>
+      <w:r>
+        <w:t>Se a moeda não estiver no meu mapa, o código tenta usar as duas primeiras letras da moeda (ex: MXN vira MX). É a nossa rede de segurança.</w:t>
+      </w:r>
+    </w:p>
+    <w:p>
+      <w:r>
+        <w:rPr>
+          <w:b/>
+          <w:bCs/>
+        </w:rPr>
+        <w:t>flagElement.src</w:t>
+      </w:r>
+      <w:r>
+        <w:t>:</w:t>
+      </w:r>
+      <w:r>
+        <w:rPr>
+          <w:b/>
+          <w:bCs/>
+        </w:rPr>
+        <w:t xml:space="preserve"> </w:t>
+      </w:r>
+      <w:r>
+        <w:t>Alte</w:t>
+      </w:r>
+      <w:r>
+        <w:t>ra o endereço da imagem no HTML em tempo real.</w:t>
+      </w:r>
+    </w:p>
+    <w:p>
+      <w:pPr>
+        <w:rPr>
+          <w:b/>
+          <w:bCs/>
+        </w:rPr>
+      </w:pPr>
+      <w:r>
+        <w:rPr>
+          <w:b/>
+          <w:bCs/>
+        </w:rPr>
+        <w:t>O Gatilho e a Inicialização</w:t>
+      </w:r>
+    </w:p>
+    <w:p>
+      <w:pPr>
+        <w:rPr>
+          <w:b/>
+          <w:bCs/>
+        </w:rPr>
+      </w:pPr>
+      <w:r>
+        <w:rPr>
+          <w:b/>
+          <w:bCs/>
+          <w:noProof/>
+        </w:rPr>
+        <w:drawing>
+          <wp:inline distT="0" distB="0" distL="0" distR="0" wp14:anchorId="3E4D565D" wp14:editId="3CC64A10">
+            <wp:extent cx="5267325" cy="846939"/>
+            <wp:effectExtent l="0" t="0" r="0" b="0"/>
+            <wp:docPr id="12" name="Imagem 12" descr="Uma imagem com texto, captura de ecrã, Tipo de letra, file&#10;&#10;Os conteúdos gerados por IA poderão estar incorretos."/>
+            <wp:cNvGraphicFramePr>
+              <a:graphicFrameLocks xmlns:a="http://schemas.openxmlformats.org/drawingml/2006/main" noChangeAspect="1"/>
+            </wp:cNvGraphicFramePr>
+            <a:graphic xmlns:a="http://schemas.openxmlformats.org/drawingml/2006/main">
+              <a:graphicData uri="http://schemas.openxmlformats.org/drawingml/2006/picture">
+                <pic:pic xmlns:pic="http://schemas.openxmlformats.org/drawingml/2006/picture">
+                  <pic:nvPicPr>
+                    <pic:cNvPr id="12" name="Imagem 12" descr="Uma imagem com texto, captura de ecrã, Tipo de letra, file&#10;&#10;Os conteúdos gerados por IA poderão estar incorretos."/>
+                    <pic:cNvPicPr/>
+                  </pic:nvPicPr>
+                  <pic:blipFill>
+                    <a:blip r:embed="rId13">
+                      <a:extLst>
+                        <a:ext uri="{28A0092B-C50C-407E-A947-70E740481C1C}">
+                          <a14:useLocalDpi xmlns:a14="http://schemas.microsoft.com/office/drawing/2010/main" val="0"/>
+                        </a:ext>
+                      </a:extLst>
+                    </a:blip>
+                    <a:stretch>
+                      <a:fillRect/>
+                    </a:stretch>
+                  </pic:blipFill>
+                  <pic:spPr>
+                    <a:xfrm>
+                      <a:off x="0" y="0"/>
+                      <a:ext cx="5276329" cy="848387"/>
+                    </a:xfrm>
+                    <a:prstGeom prst="rect">
+                      <a:avLst/>
+                    </a:prstGeom>
+                  </pic:spPr>
+                </pic:pic>
+              </a:graphicData>
+            </a:graphic>
+          </wp:inline>
+        </w:drawing>
+      </w:r>
+    </w:p>
+    <w:p>
+      <w:r>
+        <w:rPr>
+          <w:b/>
+          <w:bCs/>
+        </w:rPr>
+        <w:t>addEventListener(‘change’)</w:t>
+      </w:r>
+      <w:r>
+        <w:t>:</w:t>
+      </w:r>
+      <w:r>
+        <w:rPr>
+          <w:b/>
+          <w:bCs/>
+        </w:rPr>
+        <w:t xml:space="preserve"> </w:t>
+      </w:r>
+      <w:r>
+        <w:t xml:space="preserve">Diz ao navegador. “Sempre que o utilizador mudar a moeda no select, troca a bandeira imediatamente. </w:t>
+      </w:r>
+    </w:p>
+    <w:p>
+      <w:r>
+        <w:rPr>
+          <w:b/>
+          <w:bCs/>
+        </w:rPr>
+        <w:t>Chamada inicial</w:t>
+      </w:r>
+      <w:r>
+        <w:t>:</w:t>
+      </w:r>
+      <w:r>
+        <w:rPr>
+          <w:b/>
+          <w:bCs/>
+        </w:rPr>
+        <w:t xml:space="preserve"> </w:t>
+      </w:r>
+      <w:r>
+        <w:t xml:space="preserve">Garante que, ao abrir a página, as bandeiras já apareçam corretamente antes de qualquer clique. </w:t>
+      </w:r>
+    </w:p>
+    <w:p/>
+    <w:p>
+      <w:pPr>
+        <w:rPr>
+          <w:b/>
+          <w:bCs/>
+        </w:rPr>
+      </w:pPr>
+    </w:p>
+    <w:p>
+      <w:pPr>
+        <w:rPr>
+          <w:b/>
+          <w:bCs/>
+          <w:noProof/>
+        </w:rPr>
+      </w:pPr>
     </w:p>
     <w:p/>
     <w:p/>

</xml_diff>